<commit_message>
feat: completed the sen preheater
</commit_message>
<xml_diff>
--- a/SEN_Preheater_Offer_Template.docx
+++ b/SEN_Preheater_Offer_Template.docx
@@ -1455,7 +1455,7 @@
                 <w:b w:val="0"/>
                 <w:sz w:val="18"/>
               </w:rPr>
-              <w:t>EXCLUSIONS</w:t>
+              <w:t>SCOPE OF SUPPLY</w:t>
             </w:r>
           </w:p>
         </w:tc>
@@ -2447,7 +2447,9 @@
           <w:sz w:val="26"/>
           <w:szCs w:val="26"/>
         </w:rPr>
-        <w:t xml:space="preserve">ENCON BURNER</w:t>
+      </w:r>
+      <w:r>
+        <w:t>SEN PREHEATER</w:t>
       </w:r>
     </w:p>
     <w:tbl>
@@ -2508,7 +2510,7 @@
                 <w:b/>
                 <w:sz w:val="20"/>
               </w:rPr>
-              <w:t>TECHNICAL DATA</w:t>
+              <w:t>TECHNICAL SPECIFICATIONS</w:t>
             </w:r>
           </w:p>
           <w:p>
@@ -2866,7 +2868,7 @@
         </w:rPr>
       </w:r>
       <w:r>
-        <w:t>ANNEXURE I — EXCLUSIONS</w:t>
+        <w:t>ANNEXURE I — SCOPE OF SUPPLY: SEN PREHEATER</w:t>
       </w:r>
     </w:p>
     <w:p>
@@ -3229,7 +3231,7 @@
         </w:trPr>
         <w:tc>
           <w:tcPr>
-            <w:tcW w:type="dxa" w:w="780"/>
+            <w:tcW w:type="dxa" w:w="680"/>
             <w:tcBorders>
               <w:top w:val="single" w:color="BFBFBF" w:sz="4"/>
               <w:left w:val="single" w:color="BFBFBF" w:sz="4"/>
@@ -3265,7 +3267,7 @@
         </w:tc>
         <w:tc>
           <w:tcPr>
-            <w:tcW w:type="dxa" w:w="4080"/>
+            <w:tcW w:type="dxa" w:w="3402"/>
             <w:tcBorders>
               <w:top w:val="single" w:color="BFBFBF" w:sz="4"/>
               <w:left w:val="single" w:color="BFBFBF" w:sz="4"/>
@@ -3301,7 +3303,7 @@
         </w:tc>
         <w:tc>
           <w:tcPr>
-            <w:tcW w:type="dxa" w:w="1100"/>
+            <w:tcW w:type="dxa" w:w="1134"/>
             <w:tcBorders>
               <w:top w:val="single" w:color="BFBFBF" w:sz="4"/>
               <w:left w:val="single" w:color="BFBFBF" w:sz="4"/>
@@ -3337,7 +3339,7 @@
         </w:tc>
         <w:tc>
           <w:tcPr>
-            <w:tcW w:type="dxa" w:w="1700"/>
+            <w:tcW w:type="dxa" w:w="1984"/>
             <w:tcBorders>
               <w:top w:val="single" w:color="BFBFBF" w:sz="4"/>
               <w:left w:val="single" w:color="BFBFBF" w:sz="4"/>
@@ -3373,7 +3375,7 @@
         </w:tc>
         <w:tc>
           <w:tcPr>
-            <w:tcW w:type="dxa" w:w="1700"/>
+            <w:tcW w:type="dxa" w:w="2268"/>
             <w:tcBorders>
               <w:top w:val="single" w:color="BFBFBF" w:sz="4"/>
               <w:left w:val="single" w:color="BFBFBF" w:sz="4"/>
@@ -3409,12 +3411,9 @@
         </w:tc>
       </w:tr>
       <w:tr>
-        <w:trPr>
-          <w:trHeight w:val="425" w:hRule="atLeast"/>
-        </w:trPr>
-        <w:tc>
-          <w:tcPr>
-            <w:tcW w:type="dxa" w:w="780"/>
+        <w:tc>
+          <w:tcPr>
+            <w:tcW w:type="dxa" w:w="680"/>
           </w:tcPr>
           <w:p>
             <w:r>
@@ -3424,81 +3423,17 @@
         </w:tc>
         <w:tc>
           <w:tcPr>
-            <w:tcW w:type="dxa" w:w="4080"/>
-          </w:tcPr>
-          <w:p>
-            <w:r>
-              <w:rPr>
-                <w:rFonts w:ascii="Calibri" w:hAnsi="Calibri"/>
-                <w:b/>
-              </w:rPr>
-            </w:r>
-            <w:r>
-              <w:rPr>
-                <w:b w:val="0"/>
-                <w:sz w:val="18"/>
-              </w:rPr>
-              <w:t>SEN Preheater</w:t>
-            </w:r>
-          </w:p>
-          <w:p>
-            <w:r>
-              <w:rPr>
-                <w:rFonts w:ascii="Calibri" w:hAnsi="Calibri"/>
-                <w:b w:val="0"/>
-              </w:rPr>
-            </w:r>
-          </w:p>
-          <w:p>
-            <w:pPr>
-              <w:pStyle w:val="ListParagraph"/>
-              <w:numPr>
-                <w:ilvl w:val="0"/>
-                <w:numId w:val="1"/>
-              </w:numPr>
-            </w:pPr>
-            <w:r>
-              <w:rPr>
-                <w:rFonts w:ascii="Calibri" w:hAnsi="Calibri"/>
-              </w:rPr>
-            </w:r>
-          </w:p>
-          <w:p>
-            <w:r>
-              <w:rPr>
-                <w:rFonts w:ascii="Calibri" w:hAnsi="Calibri"/>
-                <w:b w:val="0"/>
-              </w:rPr>
-            </w:r>
-          </w:p>
-          <w:p>
-            <w:r>
-              <w:rPr>
-                <w:rFonts w:ascii="Calibri" w:hAnsi="Calibri"/>
-                <w:b w:val="0"/>
-              </w:rPr>
-            </w:r>
-          </w:p>
-          <w:p>
-            <w:r>
-              <w:rPr>
-                <w:rFonts w:ascii="Calibri" w:hAnsi="Calibri"/>
-                <w:b w:val="0"/>
-              </w:rPr>
-            </w:r>
-          </w:p>
-          <w:p>
-            <w:r>
-              <w:rPr>
-                <w:rFonts w:ascii="Calibri" w:hAnsi="Calibri"/>
-                <w:b w:val="0"/>
-              </w:rPr>
-            </w:r>
-          </w:p>
-        </w:tc>
-        <w:tc>
-          <w:tcPr>
-            <w:tcW w:type="dxa" w:w="1100"/>
+            <w:tcW w:type="dxa" w:w="3402"/>
+          </w:tcPr>
+          <w:p>
+            <w:r>
+              <w:t>SEN Preheater ({{ gas_line }} Line)</w:t>
+            </w:r>
+          </w:p>
+        </w:tc>
+        <w:tc>
+          <w:tcPr>
+            <w:tcW w:type="dxa" w:w="1134"/>
           </w:tcPr>
           <w:p>
             <w:r>
@@ -3508,7 +3443,7 @@
         </w:tc>
         <w:tc>
           <w:tcPr>
-            <w:tcW w:type="dxa" w:w="1700"/>
+            <w:tcW w:type="dxa" w:w="1984"/>
           </w:tcPr>
           <w:p>
             <w:r>
@@ -3518,7 +3453,7 @@
         </w:tc>
         <w:tc>
           <w:tcPr>
-            <w:tcW w:type="dxa" w:w="1700"/>
+            <w:tcW w:type="dxa" w:w="2268"/>
           </w:tcPr>
           <w:p>
             <w:r>
@@ -3528,24 +3463,709 @@
         </w:tc>
       </w:tr>
       <w:tr>
-        <w:trPr>
-          <w:trHeight w:val="425" w:hRule="atLeast"/>
-        </w:trPr>
-        <w:tc>
-          <w:tcPr>
-            <w:tcW w:type="dxa" w:w="780"/>
-          </w:tcPr>
-          <w:p>
-            <w:r>
-              <w:rPr>
-                <w:b/>
-              </w:rPr>
-            </w:r>
-          </w:p>
-        </w:tc>
-        <w:tc>
-          <w:tcPr>
-            <w:tcW w:type="dxa" w:w="4080"/>
+        <w:tc>
+          <w:tcPr>
+            <w:tcW w:type="dxa" w:w="680"/>
+          </w:tcPr>
+          <w:p>
+            <w:r>
+              <w:t>{%tr if has_adjustments %}</w:t>
+            </w:r>
+          </w:p>
+        </w:tc>
+        <w:tc>
+          <w:tcPr>
+            <w:tcW w:type="dxa" w:w="3402"/>
+          </w:tcPr>
+          <w:p>
+            <w:r/>
+          </w:p>
+        </w:tc>
+        <w:tc>
+          <w:tcPr>
+            <w:tcW w:type="dxa" w:w="1134"/>
+          </w:tcPr>
+          <w:p>
+            <w:r/>
+          </w:p>
+        </w:tc>
+        <w:tc>
+          <w:tcPr>
+            <w:tcW w:type="dxa" w:w="1984"/>
+          </w:tcPr>
+          <w:p>
+            <w:r/>
+          </w:p>
+        </w:tc>
+        <w:tc>
+          <w:tcPr>
+            <w:tcW w:type="dxa" w:w="2268"/>
+          </w:tcPr>
+          <w:p>
+            <w:r/>
+          </w:p>
+        </w:tc>
+      </w:tr>
+      <w:tr>
+        <w:tc>
+          <w:tcPr>
+            <w:tcW w:type="dxa" w:w="680"/>
+          </w:tcPr>
+          <w:p>
+            <w:r>
+              <w:rPr>
+                <w:b/>
+              </w:rPr>
+            </w:r>
+          </w:p>
+        </w:tc>
+        <w:tc>
+          <w:tcPr>
+            <w:tcW w:type="dxa" w:w="3402"/>
+          </w:tcPr>
+          <w:p>
+            <w:r>
+              <w:rPr>
+                <w:b/>
+              </w:rPr>
+              <w:t>Subtotal</w:t>
+            </w:r>
+          </w:p>
+        </w:tc>
+        <w:tc>
+          <w:tcPr>
+            <w:tcW w:type="dxa" w:w="1134"/>
+          </w:tcPr>
+          <w:p>
+            <w:r>
+              <w:rPr>
+                <w:b/>
+              </w:rPr>
+            </w:r>
+          </w:p>
+        </w:tc>
+        <w:tc>
+          <w:tcPr>
+            <w:tcW w:type="dxa" w:w="1984"/>
+          </w:tcPr>
+          <w:p>
+            <w:r>
+              <w:rPr>
+                <w:b/>
+              </w:rPr>
+            </w:r>
+          </w:p>
+        </w:tc>
+        <w:tc>
+          <w:tcPr>
+            <w:tcW w:type="dxa" w:w="2268"/>
+          </w:tcPr>
+          <w:p>
+            <w:r>
+              <w:rPr>
+                <w:b/>
+              </w:rPr>
+              <w:t>{{ equip_subtotal }}</w:t>
+            </w:r>
+          </w:p>
+        </w:tc>
+      </w:tr>
+      <w:tr>
+        <w:tc>
+          <w:tcPr>
+            <w:tcW w:type="dxa" w:w="680"/>
+          </w:tcPr>
+          <w:p>
+            <w:r>
+              <w:t>{%tr if show_pf %}</w:t>
+            </w:r>
+          </w:p>
+        </w:tc>
+        <w:tc>
+          <w:tcPr>
+            <w:tcW w:type="dxa" w:w="3402"/>
+          </w:tcPr>
+          <w:p>
+            <w:r/>
+          </w:p>
+        </w:tc>
+        <w:tc>
+          <w:tcPr>
+            <w:tcW w:type="dxa" w:w="1134"/>
+          </w:tcPr>
+          <w:p>
+            <w:r/>
+          </w:p>
+        </w:tc>
+        <w:tc>
+          <w:tcPr>
+            <w:tcW w:type="dxa" w:w="1984"/>
+          </w:tcPr>
+          <w:p>
+            <w:r/>
+          </w:p>
+        </w:tc>
+        <w:tc>
+          <w:tcPr>
+            <w:tcW w:type="dxa" w:w="2268"/>
+          </w:tcPr>
+          <w:p>
+            <w:r/>
+          </w:p>
+        </w:tc>
+      </w:tr>
+      <w:tr>
+        <w:tc>
+          <w:tcPr>
+            <w:tcW w:type="dxa" w:w="680"/>
+          </w:tcPr>
+          <w:p>
+            <w:r/>
+          </w:p>
+        </w:tc>
+        <w:tc>
+          <w:tcPr>
+            <w:tcW w:type="dxa" w:w="3402"/>
+          </w:tcPr>
+          <w:p>
+            <w:r>
+              <w:t>Packaging &amp; Forwarding ({{ pf_pct }}%)</w:t>
+            </w:r>
+          </w:p>
+        </w:tc>
+        <w:tc>
+          <w:tcPr>
+            <w:tcW w:type="dxa" w:w="1134"/>
+          </w:tcPr>
+          <w:p>
+            <w:r/>
+          </w:p>
+        </w:tc>
+        <w:tc>
+          <w:tcPr>
+            <w:tcW w:type="dxa" w:w="1984"/>
+          </w:tcPr>
+          <w:p>
+            <w:r/>
+          </w:p>
+        </w:tc>
+        <w:tc>
+          <w:tcPr>
+            <w:tcW w:type="dxa" w:w="2268"/>
+          </w:tcPr>
+          <w:p>
+            <w:r>
+              <w:t>{{ pf_amount_str }}</w:t>
+            </w:r>
+          </w:p>
+        </w:tc>
+      </w:tr>
+      <w:tr>
+        <w:tc>
+          <w:tcPr>
+            <w:tcW w:type="dxa" w:w="680"/>
+          </w:tcPr>
+          <w:p>
+            <w:r>
+              <w:t>{%tr endif %}</w:t>
+            </w:r>
+          </w:p>
+        </w:tc>
+        <w:tc>
+          <w:tcPr>
+            <w:tcW w:type="dxa" w:w="3402"/>
+          </w:tcPr>
+          <w:p>
+            <w:r/>
+          </w:p>
+        </w:tc>
+        <w:tc>
+          <w:tcPr>
+            <w:tcW w:type="dxa" w:w="1134"/>
+          </w:tcPr>
+          <w:p>
+            <w:r/>
+          </w:p>
+        </w:tc>
+        <w:tc>
+          <w:tcPr>
+            <w:tcW w:type="dxa" w:w="1984"/>
+          </w:tcPr>
+          <w:p>
+            <w:r/>
+          </w:p>
+        </w:tc>
+        <w:tc>
+          <w:tcPr>
+            <w:tcW w:type="dxa" w:w="2268"/>
+          </w:tcPr>
+          <w:p>
+            <w:r/>
+          </w:p>
+        </w:tc>
+      </w:tr>
+      <w:tr>
+        <w:tc>
+          <w:tcPr>
+            <w:tcW w:type="dxa" w:w="680"/>
+          </w:tcPr>
+          <w:p>
+            <w:r>
+              <w:t>{%tr if show_design %}</w:t>
+            </w:r>
+          </w:p>
+        </w:tc>
+        <w:tc>
+          <w:tcPr>
+            <w:tcW w:type="dxa" w:w="3402"/>
+          </w:tcPr>
+          <w:p>
+            <w:r/>
+          </w:p>
+        </w:tc>
+        <w:tc>
+          <w:tcPr>
+            <w:tcW w:type="dxa" w:w="1134"/>
+          </w:tcPr>
+          <w:p>
+            <w:r/>
+          </w:p>
+        </w:tc>
+        <w:tc>
+          <w:tcPr>
+            <w:tcW w:type="dxa" w:w="1984"/>
+          </w:tcPr>
+          <w:p>
+            <w:r/>
+          </w:p>
+        </w:tc>
+        <w:tc>
+          <w:tcPr>
+            <w:tcW w:type="dxa" w:w="2268"/>
+          </w:tcPr>
+          <w:p>
+            <w:r/>
+          </w:p>
+        </w:tc>
+      </w:tr>
+      <w:tr>
+        <w:tc>
+          <w:tcPr>
+            <w:tcW w:type="dxa" w:w="680"/>
+          </w:tcPr>
+          <w:p>
+            <w:r/>
+          </w:p>
+        </w:tc>
+        <w:tc>
+          <w:tcPr>
+            <w:tcW w:type="dxa" w:w="3402"/>
+          </w:tcPr>
+          <w:p>
+            <w:r>
+              <w:t>Designing Charges ({{ design_pct }}%)</w:t>
+            </w:r>
+          </w:p>
+        </w:tc>
+        <w:tc>
+          <w:tcPr>
+            <w:tcW w:type="dxa" w:w="1134"/>
+          </w:tcPr>
+          <w:p>
+            <w:r/>
+          </w:p>
+        </w:tc>
+        <w:tc>
+          <w:tcPr>
+            <w:tcW w:type="dxa" w:w="1984"/>
+          </w:tcPr>
+          <w:p>
+            <w:r/>
+          </w:p>
+        </w:tc>
+        <w:tc>
+          <w:tcPr>
+            <w:tcW w:type="dxa" w:w="2268"/>
+          </w:tcPr>
+          <w:p>
+            <w:r>
+              <w:t>{{ design_amount_str }}</w:t>
+            </w:r>
+          </w:p>
+        </w:tc>
+      </w:tr>
+      <w:tr>
+        <w:tc>
+          <w:tcPr>
+            <w:tcW w:type="dxa" w:w="680"/>
+          </w:tcPr>
+          <w:p>
+            <w:r>
+              <w:t>{%tr endif %}</w:t>
+            </w:r>
+          </w:p>
+        </w:tc>
+        <w:tc>
+          <w:tcPr>
+            <w:tcW w:type="dxa" w:w="3402"/>
+          </w:tcPr>
+          <w:p>
+            <w:r/>
+          </w:p>
+        </w:tc>
+        <w:tc>
+          <w:tcPr>
+            <w:tcW w:type="dxa" w:w="1134"/>
+          </w:tcPr>
+          <w:p>
+            <w:r/>
+          </w:p>
+        </w:tc>
+        <w:tc>
+          <w:tcPr>
+            <w:tcW w:type="dxa" w:w="1984"/>
+          </w:tcPr>
+          <w:p>
+            <w:r/>
+          </w:p>
+        </w:tc>
+        <w:tc>
+          <w:tcPr>
+            <w:tcW w:type="dxa" w:w="2268"/>
+          </w:tcPr>
+          <w:p>
+            <w:r/>
+          </w:p>
+        </w:tc>
+      </w:tr>
+      <w:tr>
+        <w:tc>
+          <w:tcPr>
+            <w:tcW w:type="dxa" w:w="680"/>
+          </w:tcPr>
+          <w:p>
+            <w:r>
+              <w:t>{%tr if show_neg %}</w:t>
+            </w:r>
+          </w:p>
+        </w:tc>
+        <w:tc>
+          <w:tcPr>
+            <w:tcW w:type="dxa" w:w="3402"/>
+          </w:tcPr>
+          <w:p>
+            <w:r/>
+          </w:p>
+        </w:tc>
+        <w:tc>
+          <w:tcPr>
+            <w:tcW w:type="dxa" w:w="1134"/>
+          </w:tcPr>
+          <w:p>
+            <w:r/>
+          </w:p>
+        </w:tc>
+        <w:tc>
+          <w:tcPr>
+            <w:tcW w:type="dxa" w:w="1984"/>
+          </w:tcPr>
+          <w:p>
+            <w:r/>
+          </w:p>
+        </w:tc>
+        <w:tc>
+          <w:tcPr>
+            <w:tcW w:type="dxa" w:w="2268"/>
+          </w:tcPr>
+          <w:p>
+            <w:r/>
+          </w:p>
+        </w:tc>
+      </w:tr>
+      <w:tr>
+        <w:tc>
+          <w:tcPr>
+            <w:tcW w:type="dxa" w:w="680"/>
+          </w:tcPr>
+          <w:p>
+            <w:r/>
+          </w:p>
+        </w:tc>
+        <w:tc>
+          <w:tcPr>
+            <w:tcW w:type="dxa" w:w="3402"/>
+          </w:tcPr>
+          <w:p>
+            <w:r>
+              <w:t>Discount / Negotiation ({{ neg_pct }}%)</w:t>
+            </w:r>
+          </w:p>
+        </w:tc>
+        <w:tc>
+          <w:tcPr>
+            <w:tcW w:type="dxa" w:w="1134"/>
+          </w:tcPr>
+          <w:p>
+            <w:r/>
+          </w:p>
+        </w:tc>
+        <w:tc>
+          <w:tcPr>
+            <w:tcW w:type="dxa" w:w="1984"/>
+          </w:tcPr>
+          <w:p>
+            <w:r/>
+          </w:p>
+        </w:tc>
+        <w:tc>
+          <w:tcPr>
+            <w:tcW w:type="dxa" w:w="2268"/>
+          </w:tcPr>
+          <w:p>
+            <w:r>
+              <w:t>- {{ neg_amount_str }}</w:t>
+            </w:r>
+          </w:p>
+        </w:tc>
+      </w:tr>
+      <w:tr>
+        <w:tc>
+          <w:tcPr>
+            <w:tcW w:type="dxa" w:w="680"/>
+          </w:tcPr>
+          <w:p>
+            <w:r>
+              <w:t>{%tr endif %}</w:t>
+            </w:r>
+          </w:p>
+        </w:tc>
+        <w:tc>
+          <w:tcPr>
+            <w:tcW w:type="dxa" w:w="3402"/>
+          </w:tcPr>
+          <w:p>
+            <w:r/>
+          </w:p>
+        </w:tc>
+        <w:tc>
+          <w:tcPr>
+            <w:tcW w:type="dxa" w:w="1134"/>
+          </w:tcPr>
+          <w:p>
+            <w:r/>
+          </w:p>
+        </w:tc>
+        <w:tc>
+          <w:tcPr>
+            <w:tcW w:type="dxa" w:w="1984"/>
+          </w:tcPr>
+          <w:p>
+            <w:r/>
+          </w:p>
+        </w:tc>
+        <w:tc>
+          <w:tcPr>
+            <w:tcW w:type="dxa" w:w="2268"/>
+          </w:tcPr>
+          <w:p>
+            <w:r/>
+          </w:p>
+        </w:tc>
+      </w:tr>
+      <w:tr>
+        <w:tc>
+          <w:tcPr>
+            <w:tcW w:type="dxa" w:w="680"/>
+          </w:tcPr>
+          <w:p>
+            <w:r>
+              <w:t>{%tr if show_transport %}</w:t>
+            </w:r>
+          </w:p>
+        </w:tc>
+        <w:tc>
+          <w:tcPr>
+            <w:tcW w:type="dxa" w:w="3402"/>
+          </w:tcPr>
+          <w:p>
+            <w:r/>
+          </w:p>
+        </w:tc>
+        <w:tc>
+          <w:tcPr>
+            <w:tcW w:type="dxa" w:w="1134"/>
+          </w:tcPr>
+          <w:p>
+            <w:r/>
+          </w:p>
+        </w:tc>
+        <w:tc>
+          <w:tcPr>
+            <w:tcW w:type="dxa" w:w="1984"/>
+          </w:tcPr>
+          <w:p>
+            <w:r/>
+          </w:p>
+        </w:tc>
+        <w:tc>
+          <w:tcPr>
+            <w:tcW w:type="dxa" w:w="2268"/>
+          </w:tcPr>
+          <w:p>
+            <w:r/>
+          </w:p>
+        </w:tc>
+      </w:tr>
+      <w:tr>
+        <w:tc>
+          <w:tcPr>
+            <w:tcW w:type="dxa" w:w="680"/>
+          </w:tcPr>
+          <w:p>
+            <w:r/>
+          </w:p>
+        </w:tc>
+        <w:tc>
+          <w:tcPr>
+            <w:tcW w:type="dxa" w:w="3402"/>
+          </w:tcPr>
+          <w:p>
+            <w:r>
+              <w:t>Freight &amp; Transport Charges</w:t>
+            </w:r>
+          </w:p>
+        </w:tc>
+        <w:tc>
+          <w:tcPr>
+            <w:tcW w:type="dxa" w:w="1134"/>
+          </w:tcPr>
+          <w:p>
+            <w:r/>
+          </w:p>
+        </w:tc>
+        <w:tc>
+          <w:tcPr>
+            <w:tcW w:type="dxa" w:w="1984"/>
+          </w:tcPr>
+          <w:p>
+            <w:r/>
+          </w:p>
+        </w:tc>
+        <w:tc>
+          <w:tcPr>
+            <w:tcW w:type="dxa" w:w="2268"/>
+          </w:tcPr>
+          <w:p>
+            <w:r>
+              <w:t>{{ transport_amt_str }}</w:t>
+            </w:r>
+          </w:p>
+        </w:tc>
+      </w:tr>
+      <w:tr>
+        <w:tc>
+          <w:tcPr>
+            <w:tcW w:type="dxa" w:w="680"/>
+          </w:tcPr>
+          <w:p>
+            <w:r>
+              <w:t>{%tr endif %}</w:t>
+            </w:r>
+          </w:p>
+        </w:tc>
+        <w:tc>
+          <w:tcPr>
+            <w:tcW w:type="dxa" w:w="3402"/>
+          </w:tcPr>
+          <w:p>
+            <w:r/>
+          </w:p>
+        </w:tc>
+        <w:tc>
+          <w:tcPr>
+            <w:tcW w:type="dxa" w:w="1134"/>
+          </w:tcPr>
+          <w:p>
+            <w:r/>
+          </w:p>
+        </w:tc>
+        <w:tc>
+          <w:tcPr>
+            <w:tcW w:type="dxa" w:w="1984"/>
+          </w:tcPr>
+          <w:p>
+            <w:r/>
+          </w:p>
+        </w:tc>
+        <w:tc>
+          <w:tcPr>
+            <w:tcW w:type="dxa" w:w="2268"/>
+          </w:tcPr>
+          <w:p>
+            <w:r/>
+          </w:p>
+        </w:tc>
+      </w:tr>
+      <w:tr>
+        <w:tc>
+          <w:tcPr>
+            <w:tcW w:type="dxa" w:w="680"/>
+          </w:tcPr>
+          <w:p>
+            <w:r>
+              <w:t>{%tr endif %}</w:t>
+            </w:r>
+          </w:p>
+        </w:tc>
+        <w:tc>
+          <w:tcPr>
+            <w:tcW w:type="dxa" w:w="3402"/>
+          </w:tcPr>
+          <w:p>
+            <w:r/>
+          </w:p>
+        </w:tc>
+        <w:tc>
+          <w:tcPr>
+            <w:tcW w:type="dxa" w:w="1134"/>
+          </w:tcPr>
+          <w:p>
+            <w:r/>
+          </w:p>
+        </w:tc>
+        <w:tc>
+          <w:tcPr>
+            <w:tcW w:type="dxa" w:w="1984"/>
+          </w:tcPr>
+          <w:p>
+            <w:r/>
+          </w:p>
+        </w:tc>
+        <w:tc>
+          <w:tcPr>
+            <w:tcW w:type="dxa" w:w="2268"/>
+          </w:tcPr>
+          <w:p>
+            <w:r/>
+          </w:p>
+        </w:tc>
+      </w:tr>
+      <w:tr>
+        <w:tc>
+          <w:tcPr>
+            <w:tcW w:type="dxa" w:w="680"/>
+          </w:tcPr>
+          <w:p>
+            <w:r>
+              <w:rPr>
+                <w:b/>
+              </w:rPr>
+            </w:r>
+          </w:p>
+        </w:tc>
+        <w:tc>
+          <w:tcPr>
+            <w:tcW w:type="dxa" w:w="3402"/>
           </w:tcPr>
           <w:p>
             <w:r>
@@ -3558,31 +4178,31 @@
         </w:tc>
         <w:tc>
           <w:tcPr>
-            <w:tcW w:type="dxa" w:w="1100"/>
-          </w:tcPr>
-          <w:p>
-            <w:r>
-              <w:rPr>
-                <w:b/>
-              </w:rPr>
-            </w:r>
-          </w:p>
-        </w:tc>
-        <w:tc>
-          <w:tcPr>
-            <w:tcW w:type="dxa" w:w="1700"/>
-          </w:tcPr>
-          <w:p>
-            <w:r>
-              <w:rPr>
-                <w:b/>
-              </w:rPr>
-            </w:r>
-          </w:p>
-        </w:tc>
-        <w:tc>
-          <w:tcPr>
-            <w:tcW w:type="dxa" w:w="1700"/>
+            <w:tcW w:type="dxa" w:w="1134"/>
+          </w:tcPr>
+          <w:p>
+            <w:r>
+              <w:rPr>
+                <w:b/>
+              </w:rPr>
+            </w:r>
+          </w:p>
+        </w:tc>
+        <w:tc>
+          <w:tcPr>
+            <w:tcW w:type="dxa" w:w="1984"/>
+          </w:tcPr>
+          <w:p>
+            <w:r>
+              <w:rPr>
+                <w:b/>
+              </w:rPr>
+            </w:r>
+          </w:p>
+        </w:tc>
+        <w:tc>
+          <w:tcPr>
+            <w:tcW w:type="dxa" w:w="2268"/>
           </w:tcPr>
           <w:p>
             <w:r>
@@ -3595,6 +4215,17 @@
         </w:tc>
       </w:tr>
     </w:tbl>
+    <w:p>
+      <w:r>
+        <w:rPr>
+          <w:b/>
+          <w:i/>
+          <w:sz w:val="18"/>
+          <w:szCs w:val="18"/>
+        </w:rPr>
+        <w:t>(Rupees {{ total_in_words }} Only)</w:t>
+      </w:r>
+    </w:p>
     <w:p>
       <w:pPr>
         <w:spacing w:before="240" w:after="0"/>

</xml_diff>

<commit_message>
feat: created combined offer for sen preheater
</commit_message>
<xml_diff>
--- a/SEN_Preheater_Offer_Template.docx
+++ b/SEN_Preheater_Offer_Template.docx
@@ -964,6 +964,7 @@
             </w:r>
             <w:r>
               <w:rPr>
+                <w:rFonts w:ascii="Arial" w:hAnsi="Arial"/>
                 <w:b/>
                 <w:sz w:val="18"/>
               </w:rPr>
@@ -1006,7 +1007,8 @@
             </w:r>
             <w:r>
               <w:rPr>
-                <w:b w:val="0"/>
+                <w:rFonts w:ascii="Arial" w:hAnsi="Arial"/>
+                <w:b/>
                 <w:sz w:val="18"/>
               </w:rPr>
               <w:t>COMPANY PROFILE</w:t>
@@ -1047,6 +1049,7 @@
             </w:r>
             <w:r>
               <w:rPr>
+                <w:rFonts w:ascii="Arial" w:hAnsi="Arial"/>
                 <w:b/>
                 <w:sz w:val="18"/>
               </w:rPr>
@@ -1086,7 +1089,8 @@
             </w:r>
             <w:r>
               <w:rPr>
-                <w:b w:val="0"/>
+                <w:rFonts w:ascii="Arial" w:hAnsi="Arial"/>
+                <w:b/>
                 <w:sz w:val="18"/>
               </w:rPr>
               <w:t>ABOUT THE CLIENT</w:t>
@@ -1124,7 +1128,14 @@
                 <w:sz w:val="22"/>
                 <w:szCs w:val="22"/>
               </w:rPr>
-              <w:t>2</w:t>
+            </w:r>
+            <w:r>
+              <w:rPr>
+                <w:rFonts w:ascii="Arial" w:hAnsi="Arial"/>
+                <w:b/>
+                <w:sz w:val="18"/>
+              </w:rPr>
+              <w:t>3.</w:t>
             </w:r>
           </w:p>
         </w:tc>
@@ -1157,67 +1168,14 @@
                 <w:sz w:val="22"/>
                 <w:szCs w:val="22"/>
               </w:rPr>
-              <w:t xml:space="preserve">Technical Specifications</w:t>
-            </w:r>
-          </w:p>
-        </w:tc>
-      </w:tr>
-      <w:tr>
-        <w:tc>
-          <w:tcPr>
-            <w:tcW w:type="dxa" w:w="1200"/>
-          </w:tcPr>
-          <w:p>
-            <w:r>
-              <w:rPr>
+            </w:r>
+            <w:r>
+              <w:rPr>
+                <w:rFonts w:ascii="Arial" w:hAnsi="Arial"/>
                 <w:b/>
                 <w:sz w:val="18"/>
               </w:rPr>
-              <w:t>3.</w:t>
-            </w:r>
-          </w:p>
-        </w:tc>
-        <w:tc>
-          <w:tcPr>
-            <w:tcW w:type="dxa" w:w="8160"/>
-          </w:tcPr>
-          <w:p>
-            <w:r>
-              <w:rPr>
-                <w:b w:val="0"/>
-                <w:sz w:val="18"/>
-              </w:rPr>
               <w:t>TECHNICAL SPECIFICATIONS</w:t>
-            </w:r>
-          </w:p>
-        </w:tc>
-      </w:tr>
-      <w:tr>
-        <w:tc>
-          <w:tcPr>
-            <w:tcW w:type="dxa" w:w="1200"/>
-          </w:tcPr>
-          <w:p>
-            <w:r>
-              <w:rPr>
-                <w:b/>
-                <w:sz w:val="18"/>
-              </w:rPr>
-              <w:t>4.</w:t>
-            </w:r>
-          </w:p>
-        </w:tc>
-        <w:tc>
-          <w:tcPr>
-            <w:tcW w:type="dxa" w:w="8160"/>
-          </w:tcPr>
-          <w:p>
-            <w:r>
-              <w:rPr>
-                <w:b w:val="0"/>
-                <w:sz w:val="18"/>
-              </w:rPr>
-              <w:t>GENERAL INFORMATION</w:t>
             </w:r>
           </w:p>
         </w:tc>
@@ -1413,6 +1371,7 @@
             </w:r>
             <w:r>
               <w:rPr>
+                <w:rFonts w:ascii="Arial" w:hAnsi="Arial"/>
                 <w:b w:val="0"/>
                 <w:sz w:val="18"/>
               </w:rPr>
@@ -1452,6 +1411,7 @@
             </w:r>
             <w:r>
               <w:rPr>
+                <w:rFonts w:ascii="Arial" w:hAnsi="Arial"/>
                 <w:b w:val="0"/>
                 <w:sz w:val="18"/>
               </w:rPr>
@@ -1494,6 +1454,7 @@
             </w:r>
             <w:r>
               <w:rPr>
+                <w:rFonts w:ascii="Arial" w:hAnsi="Arial"/>
                 <w:b w:val="0"/>
                 <w:sz w:val="18"/>
               </w:rPr>
@@ -1537,6 +1498,7 @@
             </w:r>
             <w:r>
               <w:rPr>
+                <w:rFonts w:ascii="Arial" w:hAnsi="Arial"/>
                 <w:b w:val="0"/>
                 <w:sz w:val="18"/>
               </w:rPr>
@@ -1576,6 +1538,7 @@
             </w:r>
             <w:r>
               <w:rPr>
+                <w:rFonts w:ascii="Arial" w:hAnsi="Arial"/>
                 <w:b w:val="0"/>
                 <w:sz w:val="18"/>
               </w:rPr>
@@ -1618,6 +1581,7 @@
             </w:r>
             <w:r>
               <w:rPr>
+                <w:rFonts w:ascii="Arial" w:hAnsi="Arial"/>
                 <w:b w:val="0"/>
                 <w:sz w:val="18"/>
               </w:rPr>
@@ -1661,6 +1625,7 @@
             </w:r>
             <w:r>
               <w:rPr>
+                <w:rFonts w:ascii="Arial" w:hAnsi="Arial"/>
                 <w:b w:val="0"/>
                 <w:sz w:val="18"/>
               </w:rPr>
@@ -1700,6 +1665,7 @@
             </w:r>
             <w:r>
               <w:rPr>
+                <w:rFonts w:ascii="Arial" w:hAnsi="Arial"/>
                 <w:b w:val="0"/>
                 <w:sz w:val="18"/>
               </w:rPr>
@@ -1742,6 +1708,7 @@
             </w:r>
             <w:r>
               <w:rPr>
+                <w:rFonts w:ascii="Arial" w:hAnsi="Arial"/>
                 <w:b w:val="0"/>
                 <w:sz w:val="18"/>
               </w:rPr>
@@ -1758,6 +1725,7 @@
           <w:p>
             <w:r>
               <w:rPr>
+                <w:rFonts w:ascii="Arial" w:hAnsi="Arial"/>
                 <w:b w:val="0"/>
                 <w:sz w:val="18"/>
               </w:rPr>
@@ -1772,6 +1740,7 @@
           <w:p>
             <w:r>
               <w:rPr>
+                <w:rFonts w:ascii="Arial" w:hAnsi="Arial"/>
                 <w:b w:val="0"/>
                 <w:sz w:val="18"/>
               </w:rPr>
@@ -1786,6 +1755,7 @@
           <w:p>
             <w:r>
               <w:rPr>
+                <w:rFonts w:ascii="Arial" w:hAnsi="Arial"/>
                 <w:b w:val="0"/>
                 <w:sz w:val="18"/>
               </w:rPr>
@@ -2491,26 +2461,24 @@
               <w:right w:val="single" w:sz="4" w:space="0" w:color="BFBFBF"/>
             </w:tcBorders>
             <w:shd w:val="clear" w:color="auto" w:fill="1A3A5C"/>
-            <w:shd w:val="clear" w:color="auto" w:fill="1A3A5C"/>
-          </w:tcPr>
-          <w:p>
-            <w:r>
-              <w:rPr>
-                <w:b/>
-              </w:rPr>
-            </w:r>
-            <w:r>
-              <w:rPr>
-                <w:b/>
+          </w:tcPr>
+          <w:p>
+            <w:pPr>
+              <w:jc w:val="center"/>
+            </w:pPr>
+            <w:r>
+              <w:rPr>
+                <w:b/>
+              </w:rPr>
+            </w:r>
+            <w:r>
+              <w:rPr>
+                <w:rFonts w:ascii="Arial" w:hAnsi="Arial"/>
+                <w:b/>
+                <w:color w:val="FFFFFF"/>
                 <w:sz w:val="20"/>
               </w:rPr>
-            </w:r>
-            <w:r>
-              <w:rPr>
-                <w:b/>
-                <w:sz w:val="20"/>
-              </w:rPr>
-              <w:t>TECHNICAL SPECIFICATIONS</w:t>
+              <w:t>TECHNICAL SPECIFICATIONS: SEN PREHEATER</w:t>
             </w:r>
           </w:p>
           <w:p>
@@ -2538,6 +2506,7 @@
             <w:r/>
             <w:r>
               <w:rPr>
+                <w:rFonts w:ascii="Arial" w:hAnsi="Arial"/>
                 <w:b/>
                 <w:sz w:val="18"/>
               </w:rPr>
@@ -2554,11 +2523,13 @@
               <w:bottom w:val="single" w:sz="4" w:space="0" w:color="BFBFBF"/>
               <w:right w:val="single" w:sz="4" w:space="0" w:color="BFBFBF"/>
             </w:tcBorders>
+            <w:shd w:val="clear" w:color="auto" w:fill="FFFFFF"/>
           </w:tcPr>
           <w:p>
             <w:r/>
             <w:r>
               <w:rPr>
+                <w:rFonts w:ascii="Arial" w:hAnsi="Arial"/>
                 <w:b w:val="0"/>
                 <w:sz w:val="18"/>
               </w:rPr>
@@ -2583,6 +2554,7 @@
             <w:r/>
             <w:r>
               <w:rPr>
+                <w:rFonts w:ascii="Arial" w:hAnsi="Arial"/>
                 <w:b/>
                 <w:sz w:val="18"/>
               </w:rPr>
@@ -2599,11 +2571,13 @@
               <w:bottom w:val="single" w:sz="4" w:space="0" w:color="BFBFBF"/>
               <w:right w:val="single" w:sz="4" w:space="0" w:color="BFBFBF"/>
             </w:tcBorders>
+            <w:shd w:val="clear" w:color="auto" w:fill="F8FAFC"/>
           </w:tcPr>
           <w:p>
             <w:r/>
             <w:r>
               <w:rPr>
+                <w:rFonts w:ascii="Arial" w:hAnsi="Arial"/>
                 <w:b w:val="0"/>
                 <w:sz w:val="18"/>
               </w:rPr>
@@ -2628,6 +2602,7 @@
             <w:r/>
             <w:r>
               <w:rPr>
+                <w:rFonts w:ascii="Arial" w:hAnsi="Arial"/>
                 <w:b/>
                 <w:sz w:val="18"/>
               </w:rPr>
@@ -2644,11 +2619,13 @@
               <w:bottom w:val="single" w:sz="4" w:space="0" w:color="BFBFBF"/>
               <w:right w:val="single" w:sz="4" w:space="0" w:color="BFBFBF"/>
             </w:tcBorders>
+            <w:shd w:val="clear" w:color="auto" w:fill="FFFFFF"/>
           </w:tcPr>
           <w:p>
             <w:r/>
             <w:r>
               <w:rPr>
+                <w:rFonts w:ascii="Arial" w:hAnsi="Arial"/>
                 <w:b w:val="0"/>
                 <w:sz w:val="18"/>
               </w:rPr>
@@ -2673,6 +2650,7 @@
             <w:r/>
             <w:r>
               <w:rPr>
+                <w:rFonts w:ascii="Arial" w:hAnsi="Arial"/>
                 <w:b/>
                 <w:sz w:val="18"/>
               </w:rPr>
@@ -2689,11 +2667,13 @@
               <w:bottom w:val="single" w:sz="4" w:space="0" w:color="BFBFBF"/>
               <w:right w:val="single" w:sz="4" w:space="0" w:color="BFBFBF"/>
             </w:tcBorders>
+            <w:shd w:val="clear" w:color="auto" w:fill="F8FAFC"/>
           </w:tcPr>
           <w:p>
             <w:r/>
             <w:r>
               <w:rPr>
+                <w:rFonts w:ascii="Arial" w:hAnsi="Arial"/>
                 <w:b w:val="0"/>
                 <w:sz w:val="18"/>
               </w:rPr>
@@ -2718,6 +2698,7 @@
             <w:r/>
             <w:r>
               <w:rPr>
+                <w:rFonts w:ascii="Arial" w:hAnsi="Arial"/>
                 <w:b/>
                 <w:sz w:val="18"/>
               </w:rPr>
@@ -2734,11 +2715,13 @@
               <w:bottom w:val="single" w:sz="4" w:space="0" w:color="BFBFBF"/>
               <w:right w:val="single" w:sz="4" w:space="0" w:color="BFBFBF"/>
             </w:tcBorders>
+            <w:shd w:val="clear" w:color="auto" w:fill="FFFFFF"/>
           </w:tcPr>
           <w:p>
             <w:r/>
             <w:r>
               <w:rPr>
+                <w:rFonts w:ascii="Arial" w:hAnsi="Arial"/>
                 <w:b w:val="0"/>
                 <w:sz w:val="18"/>
               </w:rPr>
@@ -2756,6 +2739,7 @@
           <w:p>
             <w:r>
               <w:rPr>
+                <w:rFonts w:ascii="Arial" w:hAnsi="Arial"/>
                 <w:b/>
                 <w:sz w:val="18"/>
               </w:rPr>
@@ -2766,10 +2750,12 @@
         <w:tc>
           <w:tcPr>
             <w:tcW w:type="dxa" w:w="5616"/>
-          </w:tcPr>
-          <w:p>
-            <w:r>
-              <w:rPr>
+            <w:shd w:val="clear" w:color="auto" w:fill="F8FAFC"/>
+          </w:tcPr>
+          <w:p>
+            <w:r>
+              <w:rPr>
+                <w:rFonts w:ascii="Arial" w:hAnsi="Arial"/>
                 <w:b w:val="0"/>
                 <w:sz w:val="18"/>
               </w:rPr>
@@ -2787,51 +2773,23 @@
           <w:p>
             <w:r>
               <w:rPr>
+                <w:rFonts w:ascii="Arial" w:hAnsi="Arial"/>
                 <w:b/>
                 <w:sz w:val="18"/>
               </w:rPr>
-              <w:t>Combustion Air Blower</w:t>
+              <w:t>Ignition of Burner</w:t>
             </w:r>
           </w:p>
         </w:tc>
         <w:tc>
           <w:tcPr>
             <w:tcW w:type="dxa" w:w="5616"/>
-          </w:tcPr>
-          <w:p>
-            <w:r>
-              <w:rPr>
-                <w:b w:val="0"/>
-                <w:sz w:val="18"/>
-              </w:rPr>
-              <w:t>{{ blower_spec_sen }}</w:t>
-            </w:r>
-          </w:p>
-        </w:tc>
-      </w:tr>
-      <w:tr>
-        <w:tc>
-          <w:tcPr>
-            <w:tcW w:type="dxa" w:w="3744"/>
-            <w:shd w:val="clear" w:color="auto" w:fill="EEF2F7"/>
-          </w:tcPr>
-          <w:p>
-            <w:r>
-              <w:rPr>
-                <w:b/>
-                <w:sz w:val="18"/>
-              </w:rPr>
-              <w:t>Ignition of Burner</w:t>
-            </w:r>
-          </w:p>
-        </w:tc>
-        <w:tc>
-          <w:tcPr>
-            <w:tcW w:type="dxa" w:w="5616"/>
-          </w:tcPr>
-          <w:p>
-            <w:r>
-              <w:rPr>
+            <w:shd w:val="clear" w:color="auto" w:fill="FFFFFF"/>
+          </w:tcPr>
+          <w:p>
+            <w:r>
+              <w:rPr>
+                <w:rFonts w:ascii="Arial" w:hAnsi="Arial"/>
                 <w:b w:val="0"/>
                 <w:sz w:val="18"/>
               </w:rPr>
@@ -2872,28 +2830,41 @@
       </w:r>
     </w:p>
     <w:p>
-      <w:r>
-        <w:rPr>
-          <w:sz w:val="18"/>
-          <w:szCs w:val="18"/>
+      <w:pPr>
+        <w:spacing w:after="80"/>
+      </w:pPr>
+      <w:r>
+        <w:rPr>
+          <w:rFonts w:ascii="Arial" w:hAnsi="Arial"/>
+          <w:sz w:val="19"/>
+          <w:szCs w:val="19"/>
         </w:rPr>
         <w:t>{{ pipeline_scope_text }}</w:t>
       </w:r>
     </w:p>
     <w:p>
-      <w:r>
-        <w:rPr>
-          <w:sz w:val="18"/>
-          <w:szCs w:val="18"/>
+      <w:pPr>
+        <w:spacing w:after="80"/>
+      </w:pPr>
+      <w:r>
+        <w:rPr>
+          <w:rFonts w:ascii="Arial" w:hAnsi="Arial"/>
+          <w:sz w:val="19"/>
+          <w:szCs w:val="19"/>
         </w:rPr>
         <w:t/>
       </w:r>
     </w:p>
     <w:p>
-      <w:r>
-        <w:rPr>
+      <w:pPr>
+        <w:spacing w:after="80"/>
+      </w:pPr>
+      <w:r>
+        <w:rPr>
+          <w:rFonts w:ascii="Arial" w:hAnsi="Arial"/>
           <w:b/>
           <w:u w:val="single"/>
+          <w:color w:val="1A3A5C"/>
           <w:sz w:val="20"/>
           <w:szCs w:val="20"/>
         </w:rPr>
@@ -2901,28 +2872,41 @@
       </w:r>
     </w:p>
     <w:p>
-      <w:r>
-        <w:rPr>
-          <w:sz w:val="18"/>
-          <w:szCs w:val="18"/>
+      <w:pPr>
+        <w:spacing w:after="80"/>
+      </w:pPr>
+      <w:r>
+        <w:rPr>
+          <w:rFonts w:ascii="Arial" w:hAnsi="Arial"/>
+          <w:sz w:val="19"/>
+          <w:szCs w:val="19"/>
         </w:rPr>
         <w:t>{{ sen_objective }}</w:t>
       </w:r>
     </w:p>
     <w:p>
-      <w:r>
-        <w:rPr>
-          <w:sz w:val="18"/>
-          <w:szCs w:val="18"/>
+      <w:pPr>
+        <w:spacing w:after="80"/>
+      </w:pPr>
+      <w:r>
+        <w:rPr>
+          <w:rFonts w:ascii="Arial" w:hAnsi="Arial"/>
+          <w:sz w:val="19"/>
+          <w:szCs w:val="19"/>
         </w:rPr>
         <w:t/>
       </w:r>
     </w:p>
     <w:p>
-      <w:r>
-        <w:rPr>
+      <w:pPr>
+        <w:spacing w:after="80"/>
+      </w:pPr>
+      <w:r>
+        <w:rPr>
+          <w:rFonts w:ascii="Arial" w:hAnsi="Arial"/>
           <w:b/>
           <w:u w:val="single"/>
+          <w:color w:val="1A3A5C"/>
           <w:sz w:val="20"/>
           <w:szCs w:val="20"/>
         </w:rPr>
@@ -2930,257 +2914,302 @@
       </w:r>
     </w:p>
     <w:p>
-      <w:r>
-        <w:rPr>
-          <w:sz w:val="18"/>
-          <w:szCs w:val="18"/>
+      <w:pPr>
+        <w:spacing w:after="80"/>
+      </w:pPr>
+      <w:r>
+        <w:rPr>
+          <w:rFonts w:ascii="Arial" w:hAnsi="Arial"/>
+          <w:sz w:val="19"/>
+          <w:szCs w:val="19"/>
         </w:rPr>
         <w:t>Our scope of supply will cover design, engineering, manufacture supply, supervision of commissioning &amp; erection of the following main components:</w:t>
       </w:r>
     </w:p>
     <w:p>
-      <w:r>
-        <w:rPr>
-          <w:sz w:val="18"/>
-          <w:szCs w:val="18"/>
+      <w:pPr>
+        <w:spacing w:after="80"/>
+      </w:pPr>
+      <w:r>
+        <w:rPr>
+          <w:rFonts w:ascii="Arial" w:hAnsi="Arial"/>
+          <w:sz w:val="19"/>
+          <w:szCs w:val="19"/>
         </w:rPr>
         <w:t/>
       </w:r>
     </w:p>
     <w:p>
-      <w:r>
-        <w:rPr>
+      <w:pPr>
+        <w:spacing w:after="80"/>
+      </w:pPr>
+      <w:r>
+        <w:rPr>
+          <w:rFonts w:ascii="Arial" w:hAnsi="Arial"/>
           <w:b/>
           <w:u w:val="single"/>
-          <w:sz w:val="18"/>
-          <w:szCs w:val="18"/>
+          <w:color w:val="1A3A5C"/>
+          <w:sz w:val="19"/>
+          <w:szCs w:val="19"/>
         </w:rPr>
         <w:t>{{ sen_burners_heading }}</w:t>
       </w:r>
     </w:p>
     <w:p>
-      <w:r>
-        <w:rPr>
-          <w:sz w:val="18"/>
-          <w:szCs w:val="18"/>
+      <w:pPr>
+        <w:spacing w:after="80"/>
+      </w:pPr>
+      <w:r>
+        <w:rPr>
+          <w:rFonts w:ascii="Arial" w:hAnsi="Arial"/>
+          <w:sz w:val="19"/>
+          <w:szCs w:val="19"/>
         </w:rPr>
         <w:t>{{ sen_burners_body }}</w:t>
       </w:r>
     </w:p>
     <w:p>
-      <w:r>
-        <w:rPr>
-          <w:sz w:val="18"/>
-          <w:szCs w:val="18"/>
+      <w:pPr>
+        <w:spacing w:after="80"/>
+      </w:pPr>
+      <w:r>
+        <w:rPr>
+          <w:rFonts w:ascii="Arial" w:hAnsi="Arial"/>
+          <w:sz w:val="19"/>
+          <w:szCs w:val="19"/>
         </w:rPr>
         <w:t/>
       </w:r>
     </w:p>
     <w:p>
-      <w:r>
-        <w:rPr>
+      <w:pPr>
+        <w:spacing w:after="80"/>
+      </w:pPr>
+      <w:r>
+        <w:rPr>
+          <w:rFonts w:ascii="Arial" w:hAnsi="Arial"/>
           <w:b/>
           <w:u w:val="single"/>
-          <w:sz w:val="18"/>
-          <w:szCs w:val="18"/>
+          <w:color w:val="1A3A5C"/>
+          <w:sz w:val="19"/>
+          <w:szCs w:val="19"/>
         </w:rPr>
         <w:t>{{ gas_line }} LINE FOR BURNERS</w:t>
       </w:r>
     </w:p>
     <w:p>
-      <w:r>
-        <w:rPr>
-          <w:sz w:val="18"/>
-          <w:szCs w:val="18"/>
+      <w:pPr>
+        <w:spacing w:after="80"/>
+      </w:pPr>
+      <w:r>
+        <w:rPr>
+          <w:rFonts w:ascii="Arial" w:hAnsi="Arial"/>
+          <w:sz w:val="19"/>
+          <w:szCs w:val="19"/>
         </w:rPr>
         <w:t>The {{ gas_line }} line for main burners shall be routed from the main gas train and will consist of the following main components:</w:t>
       </w:r>
     </w:p>
     <w:p>
-      <w:r>
-        <w:rPr>
-          <w:sz w:val="18"/>
-          <w:szCs w:val="18"/>
+      <w:pPr>
+        <w:spacing w:after="80"/>
+      </w:pPr>
+      <w:r>
+        <w:rPr>
+          <w:rFonts w:ascii="Arial" w:hAnsi="Arial"/>
+          <w:sz w:val="19"/>
+          <w:szCs w:val="19"/>
         </w:rPr>
         <w:t>{%p for x in fuel1_line_items %}</w:t>
       </w:r>
     </w:p>
     <w:p>
-      <w:r>
-        <w:rPr>
-          <w:sz w:val="18"/>
-          <w:szCs w:val="18"/>
-        </w:rPr>
-        <w:t>·  {{ x.item }}</w:t>
-      </w:r>
-    </w:p>
-    <w:p>
-      <w:r>
-        <w:rPr>
-          <w:sz w:val="18"/>
-          <w:szCs w:val="18"/>
+      <w:pPr>
+        <w:spacing w:after="80"/>
+      </w:pPr>
+      <w:r>
+        <w:rPr>
+          <w:rFonts w:ascii="Arial" w:hAnsi="Arial"/>
+          <w:sz w:val="19"/>
+          <w:szCs w:val="19"/>
+        </w:rPr>
+        <w:t>•  {{ x.item }}</w:t>
+      </w:r>
+    </w:p>
+    <w:p>
+      <w:pPr>
+        <w:spacing w:after="80"/>
+      </w:pPr>
+      <w:r>
+        <w:rPr>
+          <w:rFonts w:ascii="Arial" w:hAnsi="Arial"/>
+          <w:sz w:val="19"/>
+          <w:szCs w:val="19"/>
         </w:rPr>
         <w:t>{%p endfor %}</w:t>
       </w:r>
     </w:p>
     <w:p>
-      <w:r>
-        <w:rPr>
-          <w:sz w:val="18"/>
-          <w:szCs w:val="18"/>
+      <w:pPr>
+        <w:spacing w:after="80"/>
+      </w:pPr>
+      <w:r>
+        <w:rPr>
+          <w:rFonts w:ascii="Arial" w:hAnsi="Arial"/>
+          <w:sz w:val="19"/>
+          <w:szCs w:val="19"/>
         </w:rPr>
         <w:t/>
       </w:r>
     </w:p>
     <w:p>
-      <w:r>
-        <w:rPr>
+      <w:pPr>
+        <w:spacing w:after="80"/>
+      </w:pPr>
+      <w:r>
+        <w:rPr>
+          <w:rFonts w:ascii="Arial" w:hAnsi="Arial"/>
           <w:b/>
           <w:u w:val="single"/>
-          <w:sz w:val="18"/>
-          <w:szCs w:val="18"/>
+          <w:color w:val="1A3A5C"/>
+          <w:sz w:val="19"/>
+          <w:szCs w:val="19"/>
         </w:rPr>
         <w:t>AIR LINE FOR MAIN BURNERS:</w:t>
       </w:r>
     </w:p>
     <w:p>
-      <w:r>
-        <w:rPr>
-          <w:sz w:val="18"/>
-          <w:szCs w:val="18"/>
+      <w:pPr>
+        <w:spacing w:after="80"/>
+      </w:pPr>
+      <w:r>
+        <w:rPr>
+          <w:rFonts w:ascii="Arial" w:hAnsi="Arial"/>
+          <w:sz w:val="19"/>
+          <w:szCs w:val="19"/>
         </w:rPr>
         <w:t>{%p for x in air_pipeline_items %}</w:t>
       </w:r>
     </w:p>
     <w:p>
-      <w:r>
-        <w:rPr>
-          <w:sz w:val="18"/>
-          <w:szCs w:val="18"/>
-        </w:rPr>
-        <w:t>·  {{ x.item }}</w:t>
-      </w:r>
-    </w:p>
-    <w:p>
-      <w:r>
-        <w:rPr>
-          <w:sz w:val="18"/>
-          <w:szCs w:val="18"/>
+      <w:pPr>
+        <w:spacing w:after="80"/>
+      </w:pPr>
+      <w:r>
+        <w:rPr>
+          <w:rFonts w:ascii="Arial" w:hAnsi="Arial"/>
+          <w:sz w:val="19"/>
+          <w:szCs w:val="19"/>
+        </w:rPr>
+        <w:t>•  {{ x.item }}</w:t>
+      </w:r>
+    </w:p>
+    <w:p>
+      <w:pPr>
+        <w:spacing w:after="80"/>
+      </w:pPr>
+      <w:r>
+        <w:rPr>
+          <w:rFonts w:ascii="Arial" w:hAnsi="Arial"/>
+          <w:sz w:val="19"/>
+          <w:szCs w:val="19"/>
         </w:rPr>
         <w:t>{%p endfor %}</w:t>
       </w:r>
     </w:p>
     <w:p>
-      <w:r>
-        <w:rPr>
-          <w:sz w:val="18"/>
-          <w:szCs w:val="18"/>
+      <w:pPr>
+        <w:spacing w:after="80"/>
+      </w:pPr>
+      <w:r>
+        <w:rPr>
+          <w:rFonts w:ascii="Arial" w:hAnsi="Arial"/>
+          <w:sz w:val="19"/>
+          <w:szCs w:val="19"/>
         </w:rPr>
         <w:t/>
       </w:r>
     </w:p>
     <w:p>
-      <w:r>
-        <w:rPr>
+      <w:pPr>
+        <w:spacing w:after="80"/>
+      </w:pPr>
+      <w:r>
+        <w:rPr>
+          <w:rFonts w:ascii="Arial" w:hAnsi="Arial"/>
           <w:b/>
           <w:u w:val="single"/>
-          <w:sz w:val="18"/>
-          <w:szCs w:val="18"/>
-        </w:rPr>
-        <w:t>COMBUSTION AIR BLOWER</w:t>
-      </w:r>
-    </w:p>
-    <w:p>
-      <w:r>
-        <w:rPr>
-          <w:sz w:val="18"/>
-          <w:szCs w:val="18"/>
-        </w:rPr>
-        <w:t>{{ sen_combustion_blower_text }}</w:t>
-      </w:r>
-    </w:p>
-    <w:p>
-      <w:r>
-        <w:rPr>
-          <w:sz w:val="18"/>
-          <w:szCs w:val="18"/>
+          <w:color w:val="1A3A5C"/>
+          <w:sz w:val="19"/>
+          <w:szCs w:val="19"/>
+        </w:rPr>
+        <w:t>TROLLEY</w:t>
+      </w:r>
+    </w:p>
+    <w:p>
+      <w:pPr>
+        <w:spacing w:after="80"/>
+      </w:pPr>
+      <w:r>
+        <w:rPr>
+          <w:rFonts w:ascii="Arial" w:hAnsi="Arial"/>
+          <w:sz w:val="19"/>
+          <w:szCs w:val="19"/>
+        </w:rPr>
+        <w:t>{{ sen_trolley_text }}</w:t>
+      </w:r>
+    </w:p>
+    <w:p>
+      <w:pPr>
+        <w:spacing w:after="80"/>
+      </w:pPr>
+      <w:r>
+        <w:rPr>
+          <w:rFonts w:ascii="Arial" w:hAnsi="Arial"/>
+          <w:sz w:val="19"/>
+          <w:szCs w:val="19"/>
         </w:rPr>
         <w:t/>
       </w:r>
     </w:p>
     <w:p>
-      <w:r>
-        <w:rPr>
+      <w:pPr>
+        <w:spacing w:after="80"/>
+      </w:pPr>
+      <w:r>
+        <w:rPr>
+          <w:rFonts w:ascii="Arial" w:hAnsi="Arial"/>
           <w:b/>
           <w:u w:val="single"/>
-          <w:sz w:val="18"/>
-          <w:szCs w:val="18"/>
-        </w:rPr>
-        <w:t>TROLLEY</w:t>
-      </w:r>
-    </w:p>
-    <w:p>
-      <w:r>
-        <w:rPr>
-          <w:sz w:val="18"/>
-          <w:szCs w:val="18"/>
-        </w:rPr>
-        <w:t>{{ sen_trolley_text }}</w:t>
-      </w:r>
-    </w:p>
-    <w:p>
-      <w:r>
-        <w:rPr>
-          <w:sz w:val="18"/>
-          <w:szCs w:val="18"/>
-        </w:rPr>
-        <w:t/>
-      </w:r>
-    </w:p>
-    <w:p>
-      <w:r>
-        <w:rPr>
-          <w:b/>
-          <w:u w:val="single"/>
-          <w:sz w:val="18"/>
-          <w:szCs w:val="18"/>
+          <w:color w:val="1A3A5C"/>
+          <w:sz w:val="19"/>
+          <w:szCs w:val="19"/>
         </w:rPr>
         <w:t>ROLLER SUPPORTED RACK WITH HANDLE</w:t>
       </w:r>
     </w:p>
     <w:p>
-      <w:r>
-        <w:rPr>
-          <w:sz w:val="18"/>
-          <w:szCs w:val="18"/>
+      <w:pPr>
+        <w:spacing w:after="80"/>
+      </w:pPr>
+      <w:r>
+        <w:rPr>
+          <w:rFonts w:ascii="Arial" w:hAnsi="Arial"/>
+          <w:sz w:val="19"/>
+          <w:szCs w:val="19"/>
         </w:rPr>
         <w:t>{{ sen_roller_rack_text }}</w:t>
       </w:r>
     </w:p>
     <w:p>
-      <w:r>
-        <w:rPr>
-          <w:sz w:val="18"/>
-          <w:szCs w:val="18"/>
-        </w:rPr>
-        <w:t/>
-      </w:r>
-    </w:p>
-    <w:p>
-      <w:r>
-        <w:rPr>
-          <w:i/>
-          <w:sz w:val="18"/>
-          <w:szCs w:val="18"/>
-        </w:rPr>
-        <w:t>Note: - {{ sen_note }}</w:t>
-      </w:r>
-    </w:p>
-    <w:p>
-      <w:r>
-        <w:rPr>
-          <w:sz w:val="18"/>
-          <w:szCs w:val="18"/>
+      <w:pPr>
+        <w:spacing w:after="80"/>
+      </w:pPr>
+      <w:r>
+        <w:rPr>
+          <w:rFonts w:ascii="Arial" w:hAnsi="Arial"/>
+          <w:sz w:val="19"/>
+          <w:szCs w:val="19"/>
         </w:rPr>
         <w:t/>
       </w:r>
@@ -3246,6 +3275,7 @@
               <w:right w:type="dxa" w:w="140"/>
             </w:tcMar>
             <w:vAlign w:val="center"/>
+            <w:shd w:val="clear" w:color="auto" w:fill="1A3A5C"/>
           </w:tcPr>
           <w:p>
             <w:pPr>
@@ -3261,7 +3291,15 @@
                 <w:sz w:val="22"/>
                 <w:szCs w:val="22"/>
               </w:rPr>
-              <w:t xml:space="preserve">S. No.</w:t>
+            </w:r>
+            <w:r>
+              <w:rPr>
+                <w:rFonts w:ascii="Arial" w:hAnsi="Arial"/>
+                <w:b/>
+                <w:color w:val="FFFFFF"/>
+                <w:sz w:val="19"/>
+              </w:rPr>
+              <w:t>S. No.</w:t>
             </w:r>
           </w:p>
         </w:tc>
@@ -3282,11 +3320,12 @@
               <w:right w:type="dxa" w:w="140"/>
             </w:tcMar>
             <w:vAlign w:val="center"/>
+            <w:shd w:val="clear" w:color="auto" w:fill="1A3A5C"/>
           </w:tcPr>
           <w:p>
             <w:pPr>
               <w:spacing w:after="40" w:before="40"/>
-              <w:jc w:val="center"/>
+              <w:jc w:val="left"/>
             </w:pPr>
             <w:r>
               <w:rPr>
@@ -3297,7 +3336,15 @@
                 <w:sz w:val="22"/>
                 <w:szCs w:val="22"/>
               </w:rPr>
-              <w:t xml:space="preserve">Item Description</w:t>
+            </w:r>
+            <w:r>
+              <w:rPr>
+                <w:rFonts w:ascii="Arial" w:hAnsi="Arial"/>
+                <w:b/>
+                <w:color w:val="FFFFFF"/>
+                <w:sz w:val="19"/>
+              </w:rPr>
+              <w:t>Item Description</w:t>
             </w:r>
           </w:p>
         </w:tc>
@@ -3318,6 +3365,7 @@
               <w:right w:type="dxa" w:w="140"/>
             </w:tcMar>
             <w:vAlign w:val="center"/>
+            <w:shd w:val="clear" w:color="auto" w:fill="1A3A5C"/>
           </w:tcPr>
           <w:p>
             <w:pPr>
@@ -3333,7 +3381,15 @@
                 <w:sz w:val="22"/>
                 <w:szCs w:val="22"/>
               </w:rPr>
-              <w:t xml:space="preserve">Qty</w:t>
+            </w:r>
+            <w:r>
+              <w:rPr>
+                <w:rFonts w:ascii="Arial" w:hAnsi="Arial"/>
+                <w:b/>
+                <w:color w:val="FFFFFF"/>
+                <w:sz w:val="19"/>
+              </w:rPr>
+              <w:t>Qty</w:t>
             </w:r>
           </w:p>
         </w:tc>
@@ -3354,11 +3410,12 @@
               <w:right w:type="dxa" w:w="140"/>
             </w:tcMar>
             <w:vAlign w:val="center"/>
+            <w:shd w:val="clear" w:color="auto" w:fill="1A3A5C"/>
           </w:tcPr>
           <w:p>
             <w:pPr>
               <w:spacing w:after="40" w:before="40"/>
-              <w:jc w:val="center"/>
+              <w:jc w:val="right"/>
             </w:pPr>
             <w:r>
               <w:rPr>
@@ -3369,7 +3426,15 @@
                 <w:sz w:val="22"/>
                 <w:szCs w:val="22"/>
               </w:rPr>
-              <w:t xml:space="preserve">Unit Price (INR)</w:t>
+            </w:r>
+            <w:r>
+              <w:rPr>
+                <w:rFonts w:ascii="Arial" w:hAnsi="Arial"/>
+                <w:b/>
+                <w:color w:val="FFFFFF"/>
+                <w:sz w:val="19"/>
+              </w:rPr>
+              <w:t>Unit Price (INR)</w:t>
             </w:r>
           </w:p>
         </w:tc>
@@ -3390,11 +3455,12 @@
               <w:right w:type="dxa" w:w="140"/>
             </w:tcMar>
             <w:vAlign w:val="center"/>
+            <w:shd w:val="clear" w:color="auto" w:fill="1A3A5C"/>
           </w:tcPr>
           <w:p>
             <w:pPr>
               <w:spacing w:after="40" w:before="40"/>
-              <w:jc w:val="center"/>
+              <w:jc w:val="right"/>
             </w:pPr>
             <w:r>
               <w:rPr>
@@ -3405,7 +3471,15 @@
                 <w:sz w:val="22"/>
                 <w:szCs w:val="22"/>
               </w:rPr>
-              <w:t xml:space="preserve">Total Price (INR)</w:t>
+            </w:r>
+            <w:r>
+              <w:rPr>
+                <w:rFonts w:ascii="Arial" w:hAnsi="Arial"/>
+                <w:b/>
+                <w:color w:val="FFFFFF"/>
+                <w:sz w:val="19"/>
+              </w:rPr>
+              <w:t>Total Price (INR)</w:t>
             </w:r>
           </w:p>
         </w:tc>
@@ -3416,7 +3490,15 @@
             <w:tcW w:type="dxa" w:w="680"/>
           </w:tcPr>
           <w:p>
-            <w:r>
+            <w:pPr>
+              <w:jc w:val="center"/>
+            </w:pPr>
+            <w:r>
+              <w:rPr>
+                <w:rFonts w:ascii="Arial" w:hAnsi="Arial"/>
+                <w:b w:val="0"/>
+                <w:sz w:val="18"/>
+              </w:rPr>
               <w:t>1.</w:t>
             </w:r>
           </w:p>
@@ -3426,7 +3508,15 @@
             <w:tcW w:type="dxa" w:w="3402"/>
           </w:tcPr>
           <w:p>
-            <w:r>
+            <w:pPr>
+              <w:jc w:val="left"/>
+            </w:pPr>
+            <w:r>
+              <w:rPr>
+                <w:rFonts w:ascii="Arial" w:hAnsi="Arial"/>
+                <w:b w:val="0"/>
+                <w:sz w:val="18"/>
+              </w:rPr>
               <w:t>SEN Preheater ({{ gas_line }} Line)</w:t>
             </w:r>
           </w:p>
@@ -3436,7 +3526,15 @@
             <w:tcW w:type="dxa" w:w="1134"/>
           </w:tcPr>
           <w:p>
-            <w:r>
+            <w:pPr>
+              <w:jc w:val="center"/>
+            </w:pPr>
+            <w:r>
+              <w:rPr>
+                <w:rFonts w:ascii="Arial" w:hAnsi="Arial"/>
+                <w:b w:val="0"/>
+                <w:sz w:val="18"/>
+              </w:rPr>
               <w:t>{{ item_qty }}</w:t>
             </w:r>
           </w:p>
@@ -3446,7 +3544,15 @@
             <w:tcW w:type="dxa" w:w="1984"/>
           </w:tcPr>
           <w:p>
-            <w:r>
+            <w:pPr>
+              <w:jc w:val="right"/>
+            </w:pPr>
+            <w:r>
+              <w:rPr>
+                <w:rFonts w:ascii="Arial" w:hAnsi="Arial"/>
+                <w:b w:val="0"/>
+                <w:sz w:val="18"/>
+              </w:rPr>
               <w:t>{{ unit_price }}</w:t>
             </w:r>
           </w:p>
@@ -3456,7 +3562,15 @@
             <w:tcW w:type="dxa" w:w="2268"/>
           </w:tcPr>
           <w:p>
-            <w:r>
+            <w:pPr>
+              <w:jc w:val="right"/>
+            </w:pPr>
+            <w:r>
+              <w:rPr>
+                <w:rFonts w:ascii="Arial" w:hAnsi="Arial"/>
+                <w:b w:val="0"/>
+                <w:sz w:val="18"/>
+              </w:rPr>
               <w:t>{{ total_price }}</w:t>
             </w:r>
           </w:p>
@@ -3466,748 +3580,90 @@
         <w:tc>
           <w:tcPr>
             <w:tcW w:type="dxa" w:w="680"/>
-          </w:tcPr>
-          <w:p>
-            <w:r>
-              <w:t>{%tr if has_adjustments %}</w:t>
+            <w:shd w:val="clear" w:color="auto" w:fill="EEF2F7"/>
+          </w:tcPr>
+          <w:p>
+            <w:pPr>
+              <w:jc w:val="center"/>
+            </w:pPr>
+            <w:r>
+              <w:rPr>
+                <w:rFonts w:ascii="Arial" w:hAnsi="Arial"/>
+                <w:b/>
+                <w:sz w:val="18"/>
+              </w:rPr>
             </w:r>
           </w:p>
         </w:tc>
         <w:tc>
           <w:tcPr>
             <w:tcW w:type="dxa" w:w="3402"/>
-          </w:tcPr>
-          <w:p>
-            <w:r/>
+            <w:shd w:val="clear" w:color="auto" w:fill="EEF2F7"/>
+          </w:tcPr>
+          <w:p>
+            <w:pPr>
+              <w:jc w:val="left"/>
+            </w:pPr>
+            <w:r>
+              <w:rPr>
+                <w:rFonts w:ascii="Arial" w:hAnsi="Arial"/>
+                <w:b/>
+                <w:sz w:val="18"/>
+              </w:rPr>
+              <w:t>TOTAL</w:t>
+            </w:r>
           </w:p>
         </w:tc>
         <w:tc>
           <w:tcPr>
             <w:tcW w:type="dxa" w:w="1134"/>
-          </w:tcPr>
-          <w:p>
-            <w:r/>
+            <w:shd w:val="clear" w:color="auto" w:fill="EEF2F7"/>
+          </w:tcPr>
+          <w:p>
+            <w:pPr>
+              <w:jc w:val="center"/>
+            </w:pPr>
+            <w:r>
+              <w:rPr>
+                <w:rFonts w:ascii="Arial" w:hAnsi="Arial"/>
+                <w:b/>
+                <w:sz w:val="18"/>
+              </w:rPr>
+            </w:r>
           </w:p>
         </w:tc>
         <w:tc>
           <w:tcPr>
             <w:tcW w:type="dxa" w:w="1984"/>
-          </w:tcPr>
-          <w:p>
-            <w:r/>
+            <w:shd w:val="clear" w:color="auto" w:fill="EEF2F7"/>
+          </w:tcPr>
+          <w:p>
+            <w:pPr>
+              <w:jc w:val="right"/>
+            </w:pPr>
+            <w:r>
+              <w:rPr>
+                <w:rFonts w:ascii="Arial" w:hAnsi="Arial"/>
+                <w:b/>
+                <w:sz w:val="18"/>
+              </w:rPr>
+            </w:r>
           </w:p>
         </w:tc>
         <w:tc>
           <w:tcPr>
             <w:tcW w:type="dxa" w:w="2268"/>
-          </w:tcPr>
-          <w:p>
-            <w:r/>
-          </w:p>
-        </w:tc>
-      </w:tr>
-      <w:tr>
-        <w:tc>
-          <w:tcPr>
-            <w:tcW w:type="dxa" w:w="680"/>
-          </w:tcPr>
-          <w:p>
-            <w:r>
-              <w:rPr>
-                <w:b/>
-              </w:rPr>
-            </w:r>
-          </w:p>
-        </w:tc>
-        <w:tc>
-          <w:tcPr>
-            <w:tcW w:type="dxa" w:w="3402"/>
-          </w:tcPr>
-          <w:p>
-            <w:r>
-              <w:rPr>
-                <w:b/>
-              </w:rPr>
-              <w:t>Subtotal</w:t>
-            </w:r>
-          </w:p>
-        </w:tc>
-        <w:tc>
-          <w:tcPr>
-            <w:tcW w:type="dxa" w:w="1134"/>
-          </w:tcPr>
-          <w:p>
-            <w:r>
-              <w:rPr>
-                <w:b/>
-              </w:rPr>
-            </w:r>
-          </w:p>
-        </w:tc>
-        <w:tc>
-          <w:tcPr>
-            <w:tcW w:type="dxa" w:w="1984"/>
-          </w:tcPr>
-          <w:p>
-            <w:r>
-              <w:rPr>
-                <w:b/>
-              </w:rPr>
-            </w:r>
-          </w:p>
-        </w:tc>
-        <w:tc>
-          <w:tcPr>
-            <w:tcW w:type="dxa" w:w="2268"/>
-          </w:tcPr>
-          <w:p>
-            <w:r>
-              <w:rPr>
-                <w:b/>
-              </w:rPr>
-              <w:t>{{ equip_subtotal }}</w:t>
-            </w:r>
-          </w:p>
-        </w:tc>
-      </w:tr>
-      <w:tr>
-        <w:tc>
-          <w:tcPr>
-            <w:tcW w:type="dxa" w:w="680"/>
-          </w:tcPr>
-          <w:p>
-            <w:r>
-              <w:t>{%tr if show_pf %}</w:t>
-            </w:r>
-          </w:p>
-        </w:tc>
-        <w:tc>
-          <w:tcPr>
-            <w:tcW w:type="dxa" w:w="3402"/>
-          </w:tcPr>
-          <w:p>
-            <w:r/>
-          </w:p>
-        </w:tc>
-        <w:tc>
-          <w:tcPr>
-            <w:tcW w:type="dxa" w:w="1134"/>
-          </w:tcPr>
-          <w:p>
-            <w:r/>
-          </w:p>
-        </w:tc>
-        <w:tc>
-          <w:tcPr>
-            <w:tcW w:type="dxa" w:w="1984"/>
-          </w:tcPr>
-          <w:p>
-            <w:r/>
-          </w:p>
-        </w:tc>
-        <w:tc>
-          <w:tcPr>
-            <w:tcW w:type="dxa" w:w="2268"/>
-          </w:tcPr>
-          <w:p>
-            <w:r/>
-          </w:p>
-        </w:tc>
-      </w:tr>
-      <w:tr>
-        <w:tc>
-          <w:tcPr>
-            <w:tcW w:type="dxa" w:w="680"/>
-          </w:tcPr>
-          <w:p>
-            <w:r/>
-          </w:p>
-        </w:tc>
-        <w:tc>
-          <w:tcPr>
-            <w:tcW w:type="dxa" w:w="3402"/>
-          </w:tcPr>
-          <w:p>
-            <w:r>
-              <w:t>Packaging &amp; Forwarding ({{ pf_pct }}%)</w:t>
-            </w:r>
-          </w:p>
-        </w:tc>
-        <w:tc>
-          <w:tcPr>
-            <w:tcW w:type="dxa" w:w="1134"/>
-          </w:tcPr>
-          <w:p>
-            <w:r/>
-          </w:p>
-        </w:tc>
-        <w:tc>
-          <w:tcPr>
-            <w:tcW w:type="dxa" w:w="1984"/>
-          </w:tcPr>
-          <w:p>
-            <w:r/>
-          </w:p>
-        </w:tc>
-        <w:tc>
-          <w:tcPr>
-            <w:tcW w:type="dxa" w:w="2268"/>
-          </w:tcPr>
-          <w:p>
-            <w:r>
-              <w:t>{{ pf_amount_str }}</w:t>
-            </w:r>
-          </w:p>
-        </w:tc>
-      </w:tr>
-      <w:tr>
-        <w:tc>
-          <w:tcPr>
-            <w:tcW w:type="dxa" w:w="680"/>
-          </w:tcPr>
-          <w:p>
-            <w:r>
-              <w:t>{%tr endif %}</w:t>
-            </w:r>
-          </w:p>
-        </w:tc>
-        <w:tc>
-          <w:tcPr>
-            <w:tcW w:type="dxa" w:w="3402"/>
-          </w:tcPr>
-          <w:p>
-            <w:r/>
-          </w:p>
-        </w:tc>
-        <w:tc>
-          <w:tcPr>
-            <w:tcW w:type="dxa" w:w="1134"/>
-          </w:tcPr>
-          <w:p>
-            <w:r/>
-          </w:p>
-        </w:tc>
-        <w:tc>
-          <w:tcPr>
-            <w:tcW w:type="dxa" w:w="1984"/>
-          </w:tcPr>
-          <w:p>
-            <w:r/>
-          </w:p>
-        </w:tc>
-        <w:tc>
-          <w:tcPr>
-            <w:tcW w:type="dxa" w:w="2268"/>
-          </w:tcPr>
-          <w:p>
-            <w:r/>
-          </w:p>
-        </w:tc>
-      </w:tr>
-      <w:tr>
-        <w:tc>
-          <w:tcPr>
-            <w:tcW w:type="dxa" w:w="680"/>
-          </w:tcPr>
-          <w:p>
-            <w:r>
-              <w:t>{%tr if show_design %}</w:t>
-            </w:r>
-          </w:p>
-        </w:tc>
-        <w:tc>
-          <w:tcPr>
-            <w:tcW w:type="dxa" w:w="3402"/>
-          </w:tcPr>
-          <w:p>
-            <w:r/>
-          </w:p>
-        </w:tc>
-        <w:tc>
-          <w:tcPr>
-            <w:tcW w:type="dxa" w:w="1134"/>
-          </w:tcPr>
-          <w:p>
-            <w:r/>
-          </w:p>
-        </w:tc>
-        <w:tc>
-          <w:tcPr>
-            <w:tcW w:type="dxa" w:w="1984"/>
-          </w:tcPr>
-          <w:p>
-            <w:r/>
-          </w:p>
-        </w:tc>
-        <w:tc>
-          <w:tcPr>
-            <w:tcW w:type="dxa" w:w="2268"/>
-          </w:tcPr>
-          <w:p>
-            <w:r/>
-          </w:p>
-        </w:tc>
-      </w:tr>
-      <w:tr>
-        <w:tc>
-          <w:tcPr>
-            <w:tcW w:type="dxa" w:w="680"/>
-          </w:tcPr>
-          <w:p>
-            <w:r/>
-          </w:p>
-        </w:tc>
-        <w:tc>
-          <w:tcPr>
-            <w:tcW w:type="dxa" w:w="3402"/>
-          </w:tcPr>
-          <w:p>
-            <w:r>
-              <w:t>Designing Charges ({{ design_pct }}%)</w:t>
-            </w:r>
-          </w:p>
-        </w:tc>
-        <w:tc>
-          <w:tcPr>
-            <w:tcW w:type="dxa" w:w="1134"/>
-          </w:tcPr>
-          <w:p>
-            <w:r/>
-          </w:p>
-        </w:tc>
-        <w:tc>
-          <w:tcPr>
-            <w:tcW w:type="dxa" w:w="1984"/>
-          </w:tcPr>
-          <w:p>
-            <w:r/>
-          </w:p>
-        </w:tc>
-        <w:tc>
-          <w:tcPr>
-            <w:tcW w:type="dxa" w:w="2268"/>
-          </w:tcPr>
-          <w:p>
-            <w:r>
-              <w:t>{{ design_amount_str }}</w:t>
-            </w:r>
-          </w:p>
-        </w:tc>
-      </w:tr>
-      <w:tr>
-        <w:tc>
-          <w:tcPr>
-            <w:tcW w:type="dxa" w:w="680"/>
-          </w:tcPr>
-          <w:p>
-            <w:r>
-              <w:t>{%tr endif %}</w:t>
-            </w:r>
-          </w:p>
-        </w:tc>
-        <w:tc>
-          <w:tcPr>
-            <w:tcW w:type="dxa" w:w="3402"/>
-          </w:tcPr>
-          <w:p>
-            <w:r/>
-          </w:p>
-        </w:tc>
-        <w:tc>
-          <w:tcPr>
-            <w:tcW w:type="dxa" w:w="1134"/>
-          </w:tcPr>
-          <w:p>
-            <w:r/>
-          </w:p>
-        </w:tc>
-        <w:tc>
-          <w:tcPr>
-            <w:tcW w:type="dxa" w:w="1984"/>
-          </w:tcPr>
-          <w:p>
-            <w:r/>
-          </w:p>
-        </w:tc>
-        <w:tc>
-          <w:tcPr>
-            <w:tcW w:type="dxa" w:w="2268"/>
-          </w:tcPr>
-          <w:p>
-            <w:r/>
-          </w:p>
-        </w:tc>
-      </w:tr>
-      <w:tr>
-        <w:tc>
-          <w:tcPr>
-            <w:tcW w:type="dxa" w:w="680"/>
-          </w:tcPr>
-          <w:p>
-            <w:r>
-              <w:t>{%tr if show_neg %}</w:t>
-            </w:r>
-          </w:p>
-        </w:tc>
-        <w:tc>
-          <w:tcPr>
-            <w:tcW w:type="dxa" w:w="3402"/>
-          </w:tcPr>
-          <w:p>
-            <w:r/>
-          </w:p>
-        </w:tc>
-        <w:tc>
-          <w:tcPr>
-            <w:tcW w:type="dxa" w:w="1134"/>
-          </w:tcPr>
-          <w:p>
-            <w:r/>
-          </w:p>
-        </w:tc>
-        <w:tc>
-          <w:tcPr>
-            <w:tcW w:type="dxa" w:w="1984"/>
-          </w:tcPr>
-          <w:p>
-            <w:r/>
-          </w:p>
-        </w:tc>
-        <w:tc>
-          <w:tcPr>
-            <w:tcW w:type="dxa" w:w="2268"/>
-          </w:tcPr>
-          <w:p>
-            <w:r/>
-          </w:p>
-        </w:tc>
-      </w:tr>
-      <w:tr>
-        <w:tc>
-          <w:tcPr>
-            <w:tcW w:type="dxa" w:w="680"/>
-          </w:tcPr>
-          <w:p>
-            <w:r/>
-          </w:p>
-        </w:tc>
-        <w:tc>
-          <w:tcPr>
-            <w:tcW w:type="dxa" w:w="3402"/>
-          </w:tcPr>
-          <w:p>
-            <w:r>
-              <w:t>Discount / Negotiation ({{ neg_pct }}%)</w:t>
-            </w:r>
-          </w:p>
-        </w:tc>
-        <w:tc>
-          <w:tcPr>
-            <w:tcW w:type="dxa" w:w="1134"/>
-          </w:tcPr>
-          <w:p>
-            <w:r/>
-          </w:p>
-        </w:tc>
-        <w:tc>
-          <w:tcPr>
-            <w:tcW w:type="dxa" w:w="1984"/>
-          </w:tcPr>
-          <w:p>
-            <w:r/>
-          </w:p>
-        </w:tc>
-        <w:tc>
-          <w:tcPr>
-            <w:tcW w:type="dxa" w:w="2268"/>
-          </w:tcPr>
-          <w:p>
-            <w:r>
-              <w:t>- {{ neg_amount_str }}</w:t>
-            </w:r>
-          </w:p>
-        </w:tc>
-      </w:tr>
-      <w:tr>
-        <w:tc>
-          <w:tcPr>
-            <w:tcW w:type="dxa" w:w="680"/>
-          </w:tcPr>
-          <w:p>
-            <w:r>
-              <w:t>{%tr endif %}</w:t>
-            </w:r>
-          </w:p>
-        </w:tc>
-        <w:tc>
-          <w:tcPr>
-            <w:tcW w:type="dxa" w:w="3402"/>
-          </w:tcPr>
-          <w:p>
-            <w:r/>
-          </w:p>
-        </w:tc>
-        <w:tc>
-          <w:tcPr>
-            <w:tcW w:type="dxa" w:w="1134"/>
-          </w:tcPr>
-          <w:p>
-            <w:r/>
-          </w:p>
-        </w:tc>
-        <w:tc>
-          <w:tcPr>
-            <w:tcW w:type="dxa" w:w="1984"/>
-          </w:tcPr>
-          <w:p>
-            <w:r/>
-          </w:p>
-        </w:tc>
-        <w:tc>
-          <w:tcPr>
-            <w:tcW w:type="dxa" w:w="2268"/>
-          </w:tcPr>
-          <w:p>
-            <w:r/>
-          </w:p>
-        </w:tc>
-      </w:tr>
-      <w:tr>
-        <w:tc>
-          <w:tcPr>
-            <w:tcW w:type="dxa" w:w="680"/>
-          </w:tcPr>
-          <w:p>
-            <w:r>
-              <w:t>{%tr if show_transport %}</w:t>
-            </w:r>
-          </w:p>
-        </w:tc>
-        <w:tc>
-          <w:tcPr>
-            <w:tcW w:type="dxa" w:w="3402"/>
-          </w:tcPr>
-          <w:p>
-            <w:r/>
-          </w:p>
-        </w:tc>
-        <w:tc>
-          <w:tcPr>
-            <w:tcW w:type="dxa" w:w="1134"/>
-          </w:tcPr>
-          <w:p>
-            <w:r/>
-          </w:p>
-        </w:tc>
-        <w:tc>
-          <w:tcPr>
-            <w:tcW w:type="dxa" w:w="1984"/>
-          </w:tcPr>
-          <w:p>
-            <w:r/>
-          </w:p>
-        </w:tc>
-        <w:tc>
-          <w:tcPr>
-            <w:tcW w:type="dxa" w:w="2268"/>
-          </w:tcPr>
-          <w:p>
-            <w:r/>
-          </w:p>
-        </w:tc>
-      </w:tr>
-      <w:tr>
-        <w:tc>
-          <w:tcPr>
-            <w:tcW w:type="dxa" w:w="680"/>
-          </w:tcPr>
-          <w:p>
-            <w:r/>
-          </w:p>
-        </w:tc>
-        <w:tc>
-          <w:tcPr>
-            <w:tcW w:type="dxa" w:w="3402"/>
-          </w:tcPr>
-          <w:p>
-            <w:r>
-              <w:t>Freight &amp; Transport Charges</w:t>
-            </w:r>
-          </w:p>
-        </w:tc>
-        <w:tc>
-          <w:tcPr>
-            <w:tcW w:type="dxa" w:w="1134"/>
-          </w:tcPr>
-          <w:p>
-            <w:r/>
-          </w:p>
-        </w:tc>
-        <w:tc>
-          <w:tcPr>
-            <w:tcW w:type="dxa" w:w="1984"/>
-          </w:tcPr>
-          <w:p>
-            <w:r/>
-          </w:p>
-        </w:tc>
-        <w:tc>
-          <w:tcPr>
-            <w:tcW w:type="dxa" w:w="2268"/>
-          </w:tcPr>
-          <w:p>
-            <w:r>
-              <w:t>{{ transport_amt_str }}</w:t>
-            </w:r>
-          </w:p>
-        </w:tc>
-      </w:tr>
-      <w:tr>
-        <w:tc>
-          <w:tcPr>
-            <w:tcW w:type="dxa" w:w="680"/>
-          </w:tcPr>
-          <w:p>
-            <w:r>
-              <w:t>{%tr endif %}</w:t>
-            </w:r>
-          </w:p>
-        </w:tc>
-        <w:tc>
-          <w:tcPr>
-            <w:tcW w:type="dxa" w:w="3402"/>
-          </w:tcPr>
-          <w:p>
-            <w:r/>
-          </w:p>
-        </w:tc>
-        <w:tc>
-          <w:tcPr>
-            <w:tcW w:type="dxa" w:w="1134"/>
-          </w:tcPr>
-          <w:p>
-            <w:r/>
-          </w:p>
-        </w:tc>
-        <w:tc>
-          <w:tcPr>
-            <w:tcW w:type="dxa" w:w="1984"/>
-          </w:tcPr>
-          <w:p>
-            <w:r/>
-          </w:p>
-        </w:tc>
-        <w:tc>
-          <w:tcPr>
-            <w:tcW w:type="dxa" w:w="2268"/>
-          </w:tcPr>
-          <w:p>
-            <w:r/>
-          </w:p>
-        </w:tc>
-      </w:tr>
-      <w:tr>
-        <w:tc>
-          <w:tcPr>
-            <w:tcW w:type="dxa" w:w="680"/>
-          </w:tcPr>
-          <w:p>
-            <w:r>
-              <w:t>{%tr endif %}</w:t>
-            </w:r>
-          </w:p>
-        </w:tc>
-        <w:tc>
-          <w:tcPr>
-            <w:tcW w:type="dxa" w:w="3402"/>
-          </w:tcPr>
-          <w:p>
-            <w:r/>
-          </w:p>
-        </w:tc>
-        <w:tc>
-          <w:tcPr>
-            <w:tcW w:type="dxa" w:w="1134"/>
-          </w:tcPr>
-          <w:p>
-            <w:r/>
-          </w:p>
-        </w:tc>
-        <w:tc>
-          <w:tcPr>
-            <w:tcW w:type="dxa" w:w="1984"/>
-          </w:tcPr>
-          <w:p>
-            <w:r/>
-          </w:p>
-        </w:tc>
-        <w:tc>
-          <w:tcPr>
-            <w:tcW w:type="dxa" w:w="2268"/>
-          </w:tcPr>
-          <w:p>
-            <w:r/>
-          </w:p>
-        </w:tc>
-      </w:tr>
-      <w:tr>
-        <w:tc>
-          <w:tcPr>
-            <w:tcW w:type="dxa" w:w="680"/>
-          </w:tcPr>
-          <w:p>
-            <w:r>
-              <w:rPr>
-                <w:b/>
-              </w:rPr>
-            </w:r>
-          </w:p>
-        </w:tc>
-        <w:tc>
-          <w:tcPr>
-            <w:tcW w:type="dxa" w:w="3402"/>
-          </w:tcPr>
-          <w:p>
-            <w:r>
-              <w:rPr>
-                <w:b/>
-              </w:rPr>
-              <w:t>TOTAL</w:t>
-            </w:r>
-          </w:p>
-        </w:tc>
-        <w:tc>
-          <w:tcPr>
-            <w:tcW w:type="dxa" w:w="1134"/>
-          </w:tcPr>
-          <w:p>
-            <w:r>
-              <w:rPr>
-                <w:b/>
-              </w:rPr>
-            </w:r>
-          </w:p>
-        </w:tc>
-        <w:tc>
-          <w:tcPr>
-            <w:tcW w:type="dxa" w:w="1984"/>
-          </w:tcPr>
-          <w:p>
-            <w:r>
-              <w:rPr>
-                <w:b/>
-              </w:rPr>
-            </w:r>
-          </w:p>
-        </w:tc>
-        <w:tc>
-          <w:tcPr>
-            <w:tcW w:type="dxa" w:w="2268"/>
-          </w:tcPr>
-          <w:p>
-            <w:r>
-              <w:rPr>
-                <w:b/>
+            <w:shd w:val="clear" w:color="auto" w:fill="EEF2F7"/>
+          </w:tcPr>
+          <w:p>
+            <w:pPr>
+              <w:jc w:val="right"/>
+            </w:pPr>
+            <w:r>
+              <w:rPr>
+                <w:rFonts w:ascii="Arial" w:hAnsi="Arial"/>
+                <w:b/>
+                <w:sz w:val="18"/>
               </w:rPr>
               <w:t>{{ grand_total }}</w:t>
             </w:r>
@@ -4216,12 +3672,16 @@
       </w:tr>
     </w:tbl>
     <w:p>
-      <w:r>
-        <w:rPr>
+      <w:pPr>
+        <w:spacing w:after="80"/>
+      </w:pPr>
+      <w:r>
+        <w:rPr>
+          <w:rFonts w:ascii="Arial" w:hAnsi="Arial"/>
           <w:b/>
           <w:i/>
-          <w:sz w:val="18"/>
-          <w:szCs w:val="18"/>
+          <w:sz w:val="19"/>
+          <w:szCs w:val="19"/>
         </w:rPr>
         <w:t>(Rupees {{ total_in_words }} Only)</w:t>
       </w:r>

</xml_diff>

<commit_message>
feat: sen oven almost completed
</commit_message>
<xml_diff>
--- a/SEN_Preheater_Offer_Template.docx
+++ b/SEN_Preheater_Offer_Template.docx
@@ -2882,6 +2882,59 @@
           <w:szCs w:val="19"/>
         </w:rPr>
         <w:t>{{ sen_objective }}</w:t>
+      </w:r>
+    </w:p>
+    <w:p>
+      <w:pPr>
+        <w:spacing w:after="80"/>
+      </w:pPr>
+      <w:r>
+        <w:rPr>
+          <w:rFonts w:ascii="Arial" w:hAnsi="Arial"/>
+          <w:sz w:val="19"/>
+          <w:szCs w:val="19"/>
+        </w:rPr>
+        <w:t/>
+      </w:r>
+    </w:p>
+    <w:p>
+      <w:pPr>
+        <w:jc w:val="center"/>
+        <w:spacing w:before="160" w:after="160"/>
+      </w:pPr>
+      <w:r>
+        <w:drawing>
+          <wp:inline xmlns:a="http://schemas.openxmlformats.org/drawingml/2006/main" xmlns:pic="http://schemas.openxmlformats.org/drawingml/2006/picture">
+            <wp:extent cx="3420000" cy="2565000"/>
+            <wp:docPr id="1003" name="Picture 1003"/>
+            <wp:cNvGraphicFramePr>
+              <a:graphicFrameLocks noChangeAspect="1"/>
+            </wp:cNvGraphicFramePr>
+            <a:graphic>
+              <a:graphicData uri="http://schemas.openxmlformats.org/drawingml/2006/picture">
+                <pic:pic>
+                  <pic:nvPicPr>
+                    <pic:cNvPr id="0" name="sen_preheater_photo.jpg"/>
+                    <pic:cNvPicPr/>
+                  </pic:nvPicPr>
+                  <pic:blipFill>
+                    <a:blip r:embed="rId18"/>
+                    <a:stretch>
+                      <a:fillRect/>
+                    </a:stretch>
+                  </pic:blipFill>
+                  <pic:spPr>
+                    <a:xfrm>
+                      <a:off x="0" y="0"/>
+                      <a:ext cx="3420000" cy="2565000"/>
+                    </a:xfrm>
+                    <a:prstGeom prst="rect"/>
+                  </pic:spPr>
+                </pic:pic>
+              </a:graphicData>
+            </a:graphic>
+          </wp:inline>
+        </w:drawing>
       </w:r>
     </w:p>
     <w:p>

</xml_diff>